<commit_message>
markdown: add WYSIWYG footnotes
</commit_message>
<xml_diff>
--- a/src/export/testdata/rich.docx
+++ b/src/export/testdata/rich.docx
@@ -481,7 +481,53 @@
         <w:pStyle w:val="Normal"/>
       </w:pPr>
       <w:r>
-        <w:t xml:space="preserve">The end.</w:t>
+        <w:t xml:space="preserve">The end has a note</w:t>
+      </w:r>
+      <w:hyperlink w:anchor="_awl_footnote_1">
+        <w:r>
+          <w:rPr>
+            <w:rStyle w:val="Hyperlink"/>
+            <w:vertAlign w:val="superscript"/>
+          </w:rPr>
+          <w:t xml:space="preserve">1</w:t>
+        </w:r>
+      </w:hyperlink>
+      <w:r>
+        <w:t xml:space="preserve"> and cites it again</w:t>
+      </w:r>
+      <w:hyperlink w:anchor="_awl_footnote_1">
+        <w:r>
+          <w:rPr>
+            <w:rStyle w:val="Hyperlink"/>
+            <w:vertAlign w:val="superscript"/>
+          </w:rPr>
+          <w:t xml:space="preserve">1</w:t>
+        </w:r>
+      </w:hyperlink>
+      <w:r>
+        <w:t xml:space="preserve">.</w:t>
+      </w:r>
+    </w:p>
+    <w:p>
+      <w:pPr>
+        <w:pStyle w:val="FootnoteText"/>
+      </w:pPr>
+      <w:bookmarkStart w:id="10001" w:name="_awl_footnote_1"/>
+      <w:r>
+        <w:rPr>
+          <w:vertAlign w:val="superscript"/>
+        </w:rPr>
+        <w:t xml:space="preserve">1 </w:t>
+      </w:r>
+      <w:bookmarkEnd w:id="10001"/>
+      <w:r>
+        <w:t xml:space="preserve">Footnote prose.</w:t>
+      </w:r>
+      <w:r>
+        <w:t xml:space="preserve"> </w:t>
+      </w:r>
+      <w:r>
+        <w:t xml:space="preserve">Continued footnote prose.</w:t>
       </w:r>
     </w:p>
     <w:sectPr>
@@ -719,6 +765,18 @@
       <w:spacing w:after="0" w:line="240" w:lineRule="auto"/>
     </w:pPr>
   </w:style>
+  <w:style w:type="paragraph" w:styleId="FootnoteText">
+    <w:name w:val="Footnote Text"/>
+    <w:basedOn w:val="Normal"/>
+    <w:pPr>
+      <w:spacing w:after="80" w:line="240" w:lineRule="auto"/>
+    </w:pPr>
+    <w:rPr>
+      <w:sz w:val="19"/>
+      <w:szCs w:val="19"/>
+      <w:color w:val="666666"/>
+    </w:rPr>
+  </w:style>
   <w:style w:type="character" w:styleId="Hyperlink">
     <w:name w:val="Hyperlink"/>
     <w:basedOn w:val="DefaultParagraphFont"/>

</xml_diff>